<commit_message>
Add article: How to Read a Horoscope - Explained From Absolute Zero (published)
</commit_message>
<xml_diff>
--- a/martanda-site/how-to-read-a-horoscope.docx
+++ b/martanda-site/how-to-read-a-horoscope.docx
@@ -3035,6 +3035,24 @@
     </w:p>
     <w:p>
       <w:pPr>
+        <w:spacing w:before="240" w:after="80"/>
+        <w:rPr>
+          <w:rFonts w:hint="eastAsia"/>
+        </w:rPr>
+      </w:pPr>
+      <w:r>
+        <w:rPr>
+          <w:rFonts w:eastAsia="Gentium Book Basic" w:cs="Gentium Book Basic"/>
+          <w:b/>
+          <w:i/>
+          <w:color w:val="6E1F2A"/>
+          <w:sz w:val="28"/>
+        </w:rPr>
+        <w:t>East Indian Style — the Sūrya Cakra</w:t>
+      </w:r>
+    </w:p>
+    <w:p>
+      <w:pPr>
         <w:jc w:val="both"/>
         <w:rPr>
           <w:rFonts w:hint="eastAsia"/>
@@ -3045,7 +3063,22 @@
           <w:rFonts w:eastAsia="Gentium Book Basic" w:cs="Gentium Book Basic"/>
           <w:sz w:val="23"/>
         </w:rPr>
-        <w:t>Here is the identical placement — the Sun sitting in Aries — drawn both ways:</w:t>
+        <w:t>A third construction, common in Bengal and Odisha, takes yet another visual approach. It's built on a 3×3 grid rather than the South Indian style's 4×4: the four corner cells are each sliced diagonally, splitting into two triangular houses apiece, while the four edge cells remain plain rectangles, and the center is left empty — exactly the way a temple gopuram tapers as it rises, if you're looking for a visual anchor. That gives eight triangular houses plus four rectangular ones, twelve in total. Like the South Indian style, the rāśis stay fixed to their positions on the grid rather than rotating around a fixed Lagna — the two styles share that underlying logic even though they look quite different on paper.</w:t>
+      </w:r>
+    </w:p>
+    <w:p>
+      <w:pPr>
+        <w:jc w:val="both"/>
+        <w:rPr>
+          <w:rFonts w:hint="eastAsia"/>
+        </w:rPr>
+      </w:pPr>
+      <w:r>
+        <w:rPr>
+          <w:rFonts w:eastAsia="Gentium Book Basic" w:cs="Gentium Book Basic"/>
+          <w:sz w:val="23"/>
+        </w:rPr>
+        <w:t>Here is the identical placement — the Sun sitting in Aries — drawn all three ways:</w:t>
       </w:r>
     </w:p>
     <w:tbl>
@@ -3056,8 +3089,9 @@
         <w:tblLook w:val="04A0" w:firstRow="1" w:lastRow="0" w:firstColumn="1" w:lastColumn="0" w:noHBand="0" w:noVBand="1"/>
       </w:tblPr>
       <w:tblGrid>
-        <w:gridCol w:w="4320"/>
-        <w:gridCol w:w="4320"/>
+        <w:gridCol w:w="3402"/>
+        <w:gridCol w:w="3402"/>
+        <w:gridCol w:w="3402"/>
       </w:tblGrid>
       <w:tr>
         <w:trPr>
@@ -3065,7 +3099,7 @@
         </w:trPr>
         <w:tc>
           <w:tcPr>
-            <w:tcW w:w="4195" w:type="dxa"/>
+            <w:tcW w:w="3402" w:type="dxa"/>
           </w:tcPr>
           <w:p>
             <w:pPr>
@@ -3078,9 +3112,10 @@
               <w:rPr>
                 <w:noProof/>
               </w:rPr>
+              <w:lastRenderedPageBreak/>
               <w:drawing>
-                <wp:inline distT="0" distB="0" distL="0" distR="0" wp14:anchorId="475B64C6" wp14:editId="1835DE91">
-                  <wp:extent cx="2448000" cy="2448000"/>
+                <wp:inline distT="0" distB="0" distL="0" distR="0" wp14:anchorId="53FD8122" wp14:editId="3F4FD0D7">
+                  <wp:extent cx="1944000" cy="1944000"/>
                   <wp:effectExtent l="0" t="0" r="0" b="0"/>
                   <wp:docPr id="1" name="Picture 1"/>
                   <wp:cNvGraphicFramePr>
@@ -3102,7 +3137,7 @@
                         <pic:spPr>
                           <a:xfrm>
                             <a:off x="0" y="0"/>
-                            <a:ext cx="2448000" cy="2448000"/>
+                            <a:ext cx="1944000" cy="1944000"/>
                           </a:xfrm>
                           <a:prstGeom prst="rect">
                             <a:avLst/>
@@ -3118,7 +3153,7 @@
         </w:tc>
         <w:tc>
           <w:tcPr>
-            <w:tcW w:w="4195" w:type="dxa"/>
+            <w:tcW w:w="3402" w:type="dxa"/>
           </w:tcPr>
           <w:p>
             <w:pPr>
@@ -3132,8 +3167,8 @@
                 <w:noProof/>
               </w:rPr>
               <w:drawing>
-                <wp:inline distT="0" distB="0" distL="0" distR="0" wp14:anchorId="65A823F6" wp14:editId="7E78728C">
-                  <wp:extent cx="2448000" cy="2448000"/>
+                <wp:inline distT="0" distB="0" distL="0" distR="0" wp14:anchorId="740B99A0" wp14:editId="7C1180F0">
+                  <wp:extent cx="1944000" cy="1944000"/>
                   <wp:effectExtent l="0" t="0" r="0" b="0"/>
                   <wp:docPr id="2" name="Picture 2"/>
                   <wp:cNvGraphicFramePr>
@@ -3155,7 +3190,60 @@
                         <pic:spPr>
                           <a:xfrm>
                             <a:off x="0" y="0"/>
-                            <a:ext cx="2448000" cy="2448000"/>
+                            <a:ext cx="1944000" cy="1944000"/>
+                          </a:xfrm>
+                          <a:prstGeom prst="rect">
+                            <a:avLst/>
+                          </a:prstGeom>
+                        </pic:spPr>
+                      </pic:pic>
+                    </a:graphicData>
+                  </a:graphic>
+                </wp:inline>
+              </w:drawing>
+            </w:r>
+          </w:p>
+        </w:tc>
+        <w:tc>
+          <w:tcPr>
+            <w:tcW w:w="3402" w:type="dxa"/>
+          </w:tcPr>
+          <w:p>
+            <w:pPr>
+              <w:jc w:val="center"/>
+              <w:rPr>
+                <w:rFonts w:hint="eastAsia"/>
+              </w:rPr>
+            </w:pPr>
+            <w:r>
+              <w:rPr>
+                <w:noProof/>
+              </w:rPr>
+              <w:drawing>
+                <wp:inline distT="0" distB="0" distL="0" distR="0" wp14:anchorId="468C7418" wp14:editId="154E8EC5">
+                  <wp:extent cx="1944000" cy="1944000"/>
+                  <wp:effectExtent l="0" t="0" r="0" b="0"/>
+                  <wp:docPr id="3" name="Picture 3"/>
+                  <wp:cNvGraphicFramePr>
+                    <a:graphicFrameLocks xmlns:a="http://schemas.openxmlformats.org/drawingml/2006/main" noChangeAspect="1"/>
+                  </wp:cNvGraphicFramePr>
+                  <a:graphic xmlns:a="http://schemas.openxmlformats.org/drawingml/2006/main">
+                    <a:graphicData uri="http://schemas.openxmlformats.org/drawingml/2006/picture">
+                      <pic:pic xmlns:pic="http://schemas.openxmlformats.org/drawingml/2006/picture">
+                        <pic:nvPicPr>
+                          <pic:cNvPr id="0" name="surya_chakra.png"/>
+                          <pic:cNvPicPr/>
+                        </pic:nvPicPr>
+                        <pic:blipFill>
+                          <a:blip r:embed="rId10"/>
+                          <a:stretch>
+                            <a:fillRect/>
+                          </a:stretch>
+                        </pic:blipFill>
+                        <pic:spPr>
+                          <a:xfrm>
+                            <a:off x="0" y="0"/>
+                            <a:ext cx="1944000" cy="1944000"/>
                           </a:xfrm>
                           <a:prstGeom prst="rect">
                             <a:avLst/>
@@ -3176,7 +3264,7 @@
         </w:trPr>
         <w:tc>
           <w:tcPr>
-            <w:tcW w:w="4320" w:type="dxa"/>
+            <w:tcW w:w="2880" w:type="dxa"/>
           </w:tcPr>
           <w:p>
             <w:pPr>
@@ -3192,14 +3280,13 @@
                 <w:b/>
                 <w:color w:val="6E1F2A"/>
               </w:rPr>
-              <w:lastRenderedPageBreak/>
               <w:t>South Indian (Guru Cakra)</w:t>
             </w:r>
           </w:p>
         </w:tc>
         <w:tc>
           <w:tcPr>
-            <w:tcW w:w="4320" w:type="dxa"/>
+            <w:tcW w:w="2880" w:type="dxa"/>
           </w:tcPr>
           <w:p>
             <w:pPr>
@@ -3216,6 +3303,28 @@
                 <w:color w:val="6E1F2A"/>
               </w:rPr>
               <w:t>North Indian (Śukra Cakra)</w:t>
+            </w:r>
+          </w:p>
+        </w:tc>
+        <w:tc>
+          <w:tcPr>
+            <w:tcW w:w="2880" w:type="dxa"/>
+          </w:tcPr>
+          <w:p>
+            <w:pPr>
+              <w:spacing w:before="120"/>
+              <w:jc w:val="center"/>
+              <w:rPr>
+                <w:rFonts w:hint="eastAsia"/>
+              </w:rPr>
+            </w:pPr>
+            <w:r>
+              <w:rPr>
+                <w:rFonts w:eastAsia="Gentium Book Basic" w:cs="Gentium Book Basic"/>
+                <w:b/>
+                <w:color w:val="6E1F2A"/>
+              </w:rPr>
+              <w:t>East Indian (Sūrya Cakra)</w:t>
             </w:r>
           </w:p>
         </w:tc>
@@ -3236,7 +3345,7 @@
           <w:color w:val="9A7B2E"/>
           <w:sz w:val="20"/>
         </w:rPr>
-        <w:t>Same information, two different visual conventions. Once you know which style you're looking at, reading either becomes a matter of habit rather than difficulty.</w:t>
+        <w:t>Same information, three different visual conventions. Once you know which style you're looking at, reading any of them becomes a matter of habit rather than difficulty.</w:t>
       </w:r>
     </w:p>
     <w:p>
@@ -3330,8 +3439,8 @@
       </w:r>
     </w:p>
     <w:sectPr>
-      <w:headerReference w:type="default" r:id="rId10"/>
-      <w:footerReference w:type="default" r:id="rId11"/>
+      <w:headerReference w:type="default" r:id="rId11"/>
+      <w:footerReference w:type="default" r:id="rId12"/>
       <w:pgSz w:w="12240" w:h="15840"/>
       <w:pgMar w:top="1440" w:right="1800" w:bottom="1440" w:left="1800" w:header="720" w:footer="720" w:gutter="0"/>
       <w:cols w:space="720"/>
@@ -3708,31 +3817,31 @@
       </w:rPr>
     </w:lvl>
   </w:abstractNum>
-  <w:num w:numId="1" w16cid:durableId="722368146">
+  <w:num w:numId="1" w16cid:durableId="1338115284">
     <w:abstractNumId w:val="8"/>
   </w:num>
-  <w:num w:numId="2" w16cid:durableId="1689673207">
+  <w:num w:numId="2" w16cid:durableId="1959875103">
     <w:abstractNumId w:val="6"/>
   </w:num>
-  <w:num w:numId="3" w16cid:durableId="1070418543">
+  <w:num w:numId="3" w16cid:durableId="1704018816">
     <w:abstractNumId w:val="5"/>
   </w:num>
-  <w:num w:numId="4" w16cid:durableId="1107385634">
+  <w:num w:numId="4" w16cid:durableId="48699761">
     <w:abstractNumId w:val="4"/>
   </w:num>
-  <w:num w:numId="5" w16cid:durableId="1345014794">
+  <w:num w:numId="5" w16cid:durableId="639307636">
     <w:abstractNumId w:val="7"/>
   </w:num>
-  <w:num w:numId="6" w16cid:durableId="2103405307">
+  <w:num w:numId="6" w16cid:durableId="1307196743">
     <w:abstractNumId w:val="3"/>
   </w:num>
-  <w:num w:numId="7" w16cid:durableId="1989743529">
+  <w:num w:numId="7" w16cid:durableId="228461180">
     <w:abstractNumId w:val="2"/>
   </w:num>
-  <w:num w:numId="8" w16cid:durableId="776753656">
+  <w:num w:numId="8" w16cid:durableId="769618575">
     <w:abstractNumId w:val="1"/>
   </w:num>
-  <w:num w:numId="9" w16cid:durableId="1740244865">
+  <w:num w:numId="9" w16cid:durableId="1884167822">
     <w:abstractNumId w:val="0"/>
   </w:num>
 </w:numbering>

</xml_diff>